<commit_message>
Added attractions page and updated Module 9 test plan
</commit_message>
<xml_diff>
--- a/MODULE-9/9.2 Assignment.docx
+++ b/MODULE-9/9.2 Assignment.docx
@@ -82,7 +82,25 @@
                 <w:sz w:val="20"/>
                 <w:szCs w:val="20"/>
               </w:rPr>
-              <w:t>Angela Vargas, Cameron Mendez, Tevyah Hanley, Zachary Anderson</w:t>
+              <w:t xml:space="preserve">Angela Vargas, Cameron Mendez, </w:t>
+            </w:r>
+            <w:proofErr w:type="spellStart"/>
+            <w:r>
+              <w:rPr>
+                <w:rFonts w:ascii="Arial" w:hAnsi="Arial" w:cs="Arial"/>
+                <w:sz w:val="20"/>
+                <w:szCs w:val="20"/>
+              </w:rPr>
+              <w:t>Tevyah</w:t>
+            </w:r>
+            <w:proofErr w:type="spellEnd"/>
+            <w:r>
+              <w:rPr>
+                <w:rFonts w:ascii="Arial" w:hAnsi="Arial" w:cs="Arial"/>
+                <w:sz w:val="20"/>
+                <w:szCs w:val="20"/>
+              </w:rPr>
+              <w:t xml:space="preserve"> Hanley, Zachary Anderson</w:t>
             </w:r>
           </w:p>
         </w:tc>
@@ -285,7 +303,23 @@
                 <w:sz w:val="20"/>
                 <w:szCs w:val="20"/>
               </w:rPr>
-              <w:t>05/04/2026</w:t>
+              <w:t>05/0</w:t>
+            </w:r>
+            <w:r>
+              <w:rPr>
+                <w:rFonts w:ascii="Arial" w:hAnsi="Arial" w:cs="Arial"/>
+                <w:sz w:val="20"/>
+                <w:szCs w:val="20"/>
+              </w:rPr>
+              <w:t>6</w:t>
+            </w:r>
+            <w:r>
+              <w:rPr>
+                <w:rFonts w:ascii="Arial" w:hAnsi="Arial" w:cs="Arial"/>
+                <w:sz w:val="20"/>
+                <w:szCs w:val="20"/>
+              </w:rPr>
+              <w:t>/2026</w:t>
             </w:r>
           </w:p>
         </w:tc>
@@ -940,6 +974,7 @@
                 <w:szCs w:val="20"/>
               </w:rPr>
             </w:pPr>
+            <w:proofErr w:type="spellStart"/>
             <w:r>
               <w:rPr>
                 <w:rFonts w:ascii="Arial" w:hAnsi="Arial" w:cs="Arial"/>
@@ -958,7 +993,18 @@
                 <w:sz w:val="20"/>
                 <w:szCs w:val="20"/>
               </w:rPr>
-              <w:t>Angela V</w:t>
+              <w:t>Angela</w:t>
+            </w:r>
+            <w:proofErr w:type="spellEnd"/>
+            <w:r>
+              <w:rPr>
+                <w:rFonts w:ascii="Arial" w:hAnsi="Arial" w:cs="Arial"/>
+                <w:b/>
+                <w:bCs/>
+                <w:sz w:val="20"/>
+                <w:szCs w:val="20"/>
+              </w:rPr>
+              <w:t xml:space="preserve"> V</w:t>
             </w:r>
           </w:p>
           <w:p>
@@ -1066,7 +1112,27 @@
                 <w:sz w:val="20"/>
                 <w:szCs w:val="20"/>
               </w:rPr>
-              <w:t>&lt;yyyy/mm/dd&gt;</w:t>
+              <w:t>&lt;</w:t>
+            </w:r>
+            <w:proofErr w:type="spellStart"/>
+            <w:r>
+              <w:rPr>
+                <w:rFonts w:ascii="Arial" w:hAnsi="Arial" w:cs="Arial"/>
+                <w:color w:val="C00000"/>
+                <w:sz w:val="20"/>
+                <w:szCs w:val="20"/>
+              </w:rPr>
+              <w:t>yyyy</w:t>
+            </w:r>
+            <w:proofErr w:type="spellEnd"/>
+            <w:r>
+              <w:rPr>
+                <w:rFonts w:ascii="Arial" w:hAnsi="Arial" w:cs="Arial"/>
+                <w:color w:val="C00000"/>
+                <w:sz w:val="20"/>
+                <w:szCs w:val="20"/>
+              </w:rPr>
+              <w:t>/mm/dd&gt;</w:t>
             </w:r>
           </w:p>
         </w:tc>
@@ -1473,7 +1539,7 @@
                 <w:sz w:val="20"/>
                 <w:szCs w:val="20"/>
               </w:rPr>
-              <w:t>.</w:t>
+              <w:t xml:space="preserve"> after logging in. </w:t>
             </w:r>
           </w:p>
         </w:tc>
@@ -1581,7 +1647,7 @@
                 <w:sz w:val="20"/>
                 <w:szCs w:val="20"/>
               </w:rPr>
-              <w:t xml:space="preserve">Comments should be substantive; this means there should be at least 2-3 well-structured sentences with constructive feedback. </w:t>
+              <w:t>The “Book Your Stay” button functioned correctly and redirected users to the reservation page without any issues. The Attractions page loaded properly and all text, images, and activity cards displayed clearly. Navigation between pages was smooth and the button placement made it easy for users to begin the reservation process.</w:t>
             </w:r>
           </w:p>
         </w:tc>
@@ -1914,6 +1980,7 @@
                 <w:szCs w:val="20"/>
               </w:rPr>
             </w:pPr>
+            <w:proofErr w:type="spellStart"/>
             <w:r>
               <w:rPr>
                 <w:rFonts w:ascii="Arial" w:hAnsi="Arial" w:cs="Arial"/>
@@ -1932,7 +1999,18 @@
                 <w:sz w:val="20"/>
                 <w:szCs w:val="20"/>
               </w:rPr>
-              <w:t>Angela V</w:t>
+              <w:t>Angela</w:t>
+            </w:r>
+            <w:proofErr w:type="spellEnd"/>
+            <w:r>
+              <w:rPr>
+                <w:rFonts w:ascii="Arial" w:hAnsi="Arial" w:cs="Arial"/>
+                <w:b/>
+                <w:bCs/>
+                <w:sz w:val="20"/>
+                <w:szCs w:val="20"/>
+              </w:rPr>
+              <w:t xml:space="preserve"> V</w:t>
             </w:r>
           </w:p>
           <w:p>
@@ -2040,7 +2118,27 @@
                 <w:sz w:val="20"/>
                 <w:szCs w:val="20"/>
               </w:rPr>
-              <w:t>&lt;yyyy/mm/dd&gt;</w:t>
+              <w:t>&lt;</w:t>
+            </w:r>
+            <w:proofErr w:type="spellStart"/>
+            <w:r>
+              <w:rPr>
+                <w:rFonts w:ascii="Arial" w:hAnsi="Arial" w:cs="Arial"/>
+                <w:color w:val="C00000"/>
+                <w:sz w:val="20"/>
+                <w:szCs w:val="20"/>
+              </w:rPr>
+              <w:t>yyyy</w:t>
+            </w:r>
+            <w:proofErr w:type="spellEnd"/>
+            <w:r>
+              <w:rPr>
+                <w:rFonts w:ascii="Arial" w:hAnsi="Arial" w:cs="Arial"/>
+                <w:color w:val="C00000"/>
+                <w:sz w:val="20"/>
+                <w:szCs w:val="20"/>
+              </w:rPr>
+              <w:t>/mm/dd&gt;</w:t>
             </w:r>
           </w:p>
         </w:tc>
@@ -2661,7 +2759,27 @@
                 <w:sz w:val="20"/>
                 <w:szCs w:val="20"/>
               </w:rPr>
-              <w:t>Comments should be substantive; this means there should be at least 2-3 well-structured sentences with constructive feedback.</w:t>
+              <w:t xml:space="preserve">The “Reserve Now” button successfully redirected users to the Reservations page after being selected. All featured attraction information displayed correctly while </w:t>
+            </w:r>
+            <w:proofErr w:type="spellStart"/>
+            <w:r>
+              <w:rPr>
+                <w:rFonts w:ascii="Arial" w:hAnsi="Arial" w:cs="Arial"/>
+                <w:color w:val="C00000"/>
+                <w:sz w:val="20"/>
+                <w:szCs w:val="20"/>
+              </w:rPr>
+              <w:t>scrolling</w:t>
+            </w:r>
+            <w:proofErr w:type="spellEnd"/>
+            <w:r>
+              <w:rPr>
+                <w:rFonts w:ascii="Arial" w:hAnsi="Arial" w:cs="Arial"/>
+                <w:color w:val="C00000"/>
+                <w:sz w:val="20"/>
+                <w:szCs w:val="20"/>
+              </w:rPr>
+              <w:t xml:space="preserve"> through the page and no formatting issues were observed. The page layout remained organized and user friendly, making the reservation option easy to locate and access.</w:t>
             </w:r>
           </w:p>
         </w:tc>
@@ -3348,7 +3466,6 @@
   <w:style w:type="character" w:default="1" w:styleId="DefaultParagraphFont">
     <w:name w:val="Default Paragraph Font"/>
     <w:uiPriority w:val="1"/>
-    <w:semiHidden/>
     <w:unhideWhenUsed/>
   </w:style>
   <w:style w:type="table" w:default="1" w:styleId="TableNormal">

</xml_diff>

<commit_message>
Completed testing on Attractions Page - Anderson 5/6/26
</commit_message>
<xml_diff>
--- a/MODULE-9/9.2 Assignment.docx
+++ b/MODULE-9/9.2 Assignment.docx
@@ -506,6 +506,9 @@
               <w:fldChar w:fldCharType="end"/>
             </w:r>
           </w:hyperlink>
+          <w:r>
+            <w:t>-3</w:t>
+          </w:r>
         </w:p>
         <w:p>
           <w:pPr>
@@ -541,43 +544,12 @@
                 <w:noProof/>
                 <w:webHidden/>
               </w:rPr>
-              <w:fldChar w:fldCharType="begin"/>
-            </w:r>
-            <w:r>
-              <w:rPr>
-                <w:noProof/>
-                <w:webHidden/>
-              </w:rPr>
-              <w:instrText xml:space="preserve"> PAGEREF _Toc132718196 \h </w:instrText>
-            </w:r>
-            <w:r>
-              <w:rPr>
-                <w:noProof/>
-                <w:webHidden/>
-              </w:rPr>
-            </w:r>
-            <w:r>
-              <w:rPr>
-                <w:noProof/>
-                <w:webHidden/>
-              </w:rPr>
-              <w:fldChar w:fldCharType="separate"/>
-            </w:r>
-            <w:r>
-              <w:rPr>
-                <w:noProof/>
-                <w:webHidden/>
-              </w:rPr>
-              <w:t>2</w:t>
-            </w:r>
-            <w:r>
-              <w:rPr>
-                <w:noProof/>
-                <w:webHidden/>
-              </w:rPr>
-              <w:fldChar w:fldCharType="end"/>
+              <w:t>4-</w:t>
             </w:r>
           </w:hyperlink>
+          <w:r>
+            <w:t>6</w:t>
+          </w:r>
         </w:p>
         <w:p>
           <w:pPr>
@@ -684,106 +656,6 @@
         </w:rPr>
       </w:pPr>
     </w:p>
-    <w:p>
-      <w:pPr>
-        <w:pStyle w:val="NoSpacing"/>
-        <w:rPr>
-          <w:rFonts w:ascii="Arial" w:hAnsi="Arial" w:cs="Arial"/>
-          <w:sz w:val="24"/>
-          <w:szCs w:val="24"/>
-        </w:rPr>
-      </w:pPr>
-    </w:p>
-    <w:p>
-      <w:pPr>
-        <w:pStyle w:val="NoSpacing"/>
-        <w:rPr>
-          <w:rFonts w:ascii="Arial" w:hAnsi="Arial" w:cs="Arial"/>
-          <w:sz w:val="24"/>
-          <w:szCs w:val="24"/>
-        </w:rPr>
-      </w:pPr>
-    </w:p>
-    <w:p>
-      <w:pPr>
-        <w:pStyle w:val="NoSpacing"/>
-        <w:rPr>
-          <w:rFonts w:ascii="Arial" w:hAnsi="Arial" w:cs="Arial"/>
-          <w:sz w:val="24"/>
-          <w:szCs w:val="24"/>
-        </w:rPr>
-      </w:pPr>
-    </w:p>
-    <w:p>
-      <w:pPr>
-        <w:pStyle w:val="NoSpacing"/>
-        <w:rPr>
-          <w:rFonts w:ascii="Arial" w:hAnsi="Arial" w:cs="Arial"/>
-          <w:sz w:val="24"/>
-          <w:szCs w:val="24"/>
-        </w:rPr>
-      </w:pPr>
-    </w:p>
-    <w:p>
-      <w:pPr>
-        <w:pStyle w:val="NoSpacing"/>
-        <w:rPr>
-          <w:rFonts w:ascii="Arial" w:hAnsi="Arial" w:cs="Arial"/>
-          <w:sz w:val="24"/>
-          <w:szCs w:val="24"/>
-        </w:rPr>
-      </w:pPr>
-    </w:p>
-    <w:p>
-      <w:pPr>
-        <w:pStyle w:val="NoSpacing"/>
-        <w:rPr>
-          <w:rFonts w:ascii="Arial" w:hAnsi="Arial" w:cs="Arial"/>
-          <w:sz w:val="24"/>
-          <w:szCs w:val="24"/>
-        </w:rPr>
-      </w:pPr>
-    </w:p>
-    <w:p>
-      <w:pPr>
-        <w:pStyle w:val="NoSpacing"/>
-        <w:rPr>
-          <w:rFonts w:ascii="Arial" w:hAnsi="Arial" w:cs="Arial"/>
-          <w:sz w:val="24"/>
-          <w:szCs w:val="24"/>
-        </w:rPr>
-      </w:pPr>
-    </w:p>
-    <w:p>
-      <w:pPr>
-        <w:pStyle w:val="NoSpacing"/>
-        <w:rPr>
-          <w:rFonts w:ascii="Arial" w:hAnsi="Arial" w:cs="Arial"/>
-          <w:sz w:val="24"/>
-          <w:szCs w:val="24"/>
-        </w:rPr>
-      </w:pPr>
-    </w:p>
-    <w:p>
-      <w:pPr>
-        <w:pStyle w:val="NoSpacing"/>
-        <w:rPr>
-          <w:rFonts w:ascii="Arial" w:hAnsi="Arial" w:cs="Arial"/>
-          <w:sz w:val="24"/>
-          <w:szCs w:val="24"/>
-        </w:rPr>
-      </w:pPr>
-    </w:p>
-    <w:p>
-      <w:pPr>
-        <w:pStyle w:val="NoSpacing"/>
-        <w:rPr>
-          <w:rFonts w:ascii="Arial" w:hAnsi="Arial" w:cs="Arial"/>
-          <w:sz w:val="24"/>
-          <w:szCs w:val="24"/>
-        </w:rPr>
-      </w:pPr>
-    </w:p>
     <w:tbl>
       <w:tblPr>
         <w:tblStyle w:val="TableGrid"/>
@@ -793,10 +665,10 @@
       </w:tblPr>
       <w:tblGrid>
         <w:gridCol w:w="1250"/>
-        <w:gridCol w:w="3571"/>
-        <w:gridCol w:w="3929"/>
-        <w:gridCol w:w="2148"/>
-        <w:gridCol w:w="2052"/>
+        <w:gridCol w:w="2663"/>
+        <w:gridCol w:w="3127"/>
+        <w:gridCol w:w="1764"/>
+        <w:gridCol w:w="4146"/>
       </w:tblGrid>
       <w:tr>
         <w:trPr>
@@ -822,6 +694,7 @@
                 <w:sz w:val="24"/>
                 <w:szCs w:val="24"/>
               </w:rPr>
+              <w:lastRenderedPageBreak/>
               <w:t>Test 1</w:t>
             </w:r>
           </w:p>
@@ -1078,6 +951,16 @@
               </w:rPr>
               <w:t xml:space="preserve">Peer tester: </w:t>
             </w:r>
+            <w:r>
+              <w:rPr>
+                <w:rFonts w:ascii="Arial" w:hAnsi="Arial" w:cs="Arial"/>
+                <w:b/>
+                <w:bCs/>
+                <w:sz w:val="20"/>
+                <w:szCs w:val="20"/>
+              </w:rPr>
+              <w:t>Zachary Anderson</w:t>
+            </w:r>
           </w:p>
           <w:p>
             <w:pPr>
@@ -1108,31 +991,10 @@
             <w:r>
               <w:rPr>
                 <w:rFonts w:ascii="Arial" w:hAnsi="Arial" w:cs="Arial"/>
-                <w:color w:val="C00000"/>
-                <w:sz w:val="20"/>
-                <w:szCs w:val="20"/>
-              </w:rPr>
-              <w:t>&lt;</w:t>
-            </w:r>
-            <w:proofErr w:type="spellStart"/>
-            <w:r>
-              <w:rPr>
-                <w:rFonts w:ascii="Arial" w:hAnsi="Arial" w:cs="Arial"/>
-                <w:color w:val="C00000"/>
-                <w:sz w:val="20"/>
-                <w:szCs w:val="20"/>
-              </w:rPr>
-              <w:t>yyyy</w:t>
-            </w:r>
-            <w:proofErr w:type="spellEnd"/>
-            <w:r>
-              <w:rPr>
-                <w:rFonts w:ascii="Arial" w:hAnsi="Arial" w:cs="Arial"/>
-                <w:color w:val="C00000"/>
-                <w:sz w:val="20"/>
-                <w:szCs w:val="20"/>
-              </w:rPr>
-              <w:t>/mm/dd&gt;</w:t>
+                <w:sz w:val="20"/>
+                <w:szCs w:val="20"/>
+              </w:rPr>
+              <w:t>5/6/26</w:t>
             </w:r>
           </w:p>
         </w:tc>
@@ -1406,7 +1268,7 @@
                 <w:sz w:val="20"/>
                 <w:szCs w:val="20"/>
               </w:rPr>
-              <w:t>&lt;yes/no&gt;</w:t>
+              <w:t>Pass</w:t>
             </w:r>
           </w:p>
         </w:tc>
@@ -1431,7 +1293,61 @@
                 <w:sz w:val="20"/>
                 <w:szCs w:val="20"/>
               </w:rPr>
-              <w:t>&lt;yes/no&gt;</w:t>
+              <w:t>Pass</w:t>
+            </w:r>
+          </w:p>
+          <w:p>
+            <w:pPr>
+              <w:spacing w:before="80" w:after="80"/>
+              <w:rPr>
+                <w:rFonts w:ascii="Arial" w:hAnsi="Arial" w:cs="Arial"/>
+                <w:color w:val="C00000"/>
+                <w:sz w:val="20"/>
+                <w:szCs w:val="20"/>
+              </w:rPr>
+            </w:pPr>
+            <w:r>
+              <w:rPr>
+                <w:rFonts w:ascii="Arial" w:hAnsi="Arial" w:cs="Arial"/>
+                <w:color w:val="C00000"/>
+                <w:sz w:val="20"/>
+                <w:szCs w:val="20"/>
+              </w:rPr>
+              <w:drawing>
+                <wp:inline distT="0" distB="0" distL="0" distR="0" wp14:anchorId="2E2FF1D3" wp14:editId="1FCE70B2">
+                  <wp:extent cx="2486737" cy="2346593"/>
+                  <wp:effectExtent l="0" t="0" r="8890" b="0"/>
+                  <wp:docPr id="1840342366" name="Picture 1"/>
+                  <wp:cNvGraphicFramePr>
+                    <a:graphicFrameLocks xmlns:a="http://schemas.openxmlformats.org/drawingml/2006/main" noChangeAspect="1"/>
+                  </wp:cNvGraphicFramePr>
+                  <a:graphic xmlns:a="http://schemas.openxmlformats.org/drawingml/2006/main">
+                    <a:graphicData uri="http://schemas.openxmlformats.org/drawingml/2006/picture">
+                      <pic:pic xmlns:pic="http://schemas.openxmlformats.org/drawingml/2006/picture">
+                        <pic:nvPicPr>
+                          <pic:cNvPr id="1840342366" name=""/>
+                          <pic:cNvPicPr/>
+                        </pic:nvPicPr>
+                        <pic:blipFill>
+                          <a:blip r:embed="rId7"/>
+                          <a:stretch>
+                            <a:fillRect/>
+                          </a:stretch>
+                        </pic:blipFill>
+                        <pic:spPr>
+                          <a:xfrm>
+                            <a:off x="0" y="0"/>
+                            <a:ext cx="2504443" cy="2363301"/>
+                          </a:xfrm>
+                          <a:prstGeom prst="rect">
+                            <a:avLst/>
+                          </a:prstGeom>
+                        </pic:spPr>
+                      </pic:pic>
+                    </a:graphicData>
+                  </a:graphic>
+                </wp:inline>
+              </w:drawing>
             </w:r>
           </w:p>
         </w:tc>
@@ -1459,6 +1375,7 @@
                 <w:sz w:val="20"/>
                 <w:szCs w:val="20"/>
               </w:rPr>
+              <w:lastRenderedPageBreak/>
               <w:t>2</w:t>
             </w:r>
           </w:p>
@@ -1564,7 +1481,7 @@
                 <w:sz w:val="20"/>
                 <w:szCs w:val="20"/>
               </w:rPr>
-              <w:t>&lt;yes/no&gt;</w:t>
+              <w:t>Pass</w:t>
             </w:r>
           </w:p>
         </w:tc>
@@ -1589,14 +1506,122 @@
                 <w:sz w:val="20"/>
                 <w:szCs w:val="20"/>
               </w:rPr>
-              <w:t>&lt;yes/no&gt;</w:t>
+              <w:t>Pass</w:t>
+            </w:r>
+          </w:p>
+          <w:p>
+            <w:pPr>
+              <w:spacing w:before="80" w:after="80"/>
+              <w:rPr>
+                <w:rFonts w:ascii="Arial" w:hAnsi="Arial" w:cs="Arial"/>
+                <w:color w:val="C00000"/>
+                <w:sz w:val="20"/>
+                <w:szCs w:val="20"/>
+              </w:rPr>
+            </w:pPr>
+            <w:r>
+              <w:rPr>
+                <w:rFonts w:ascii="Arial" w:hAnsi="Arial" w:cs="Arial"/>
+                <w:color w:val="C00000"/>
+                <w:sz w:val="20"/>
+                <w:szCs w:val="20"/>
+              </w:rPr>
+              <w:drawing>
+                <wp:inline distT="0" distB="0" distL="0" distR="0" wp14:anchorId="6746206D" wp14:editId="2B27621F">
+                  <wp:extent cx="1379718" cy="1650605"/>
+                  <wp:effectExtent l="0" t="0" r="0" b="6985"/>
+                  <wp:docPr id="439578902" name="Picture 1"/>
+                  <wp:cNvGraphicFramePr>
+                    <a:graphicFrameLocks xmlns:a="http://schemas.openxmlformats.org/drawingml/2006/main" noChangeAspect="1"/>
+                  </wp:cNvGraphicFramePr>
+                  <a:graphic xmlns:a="http://schemas.openxmlformats.org/drawingml/2006/main">
+                    <a:graphicData uri="http://schemas.openxmlformats.org/drawingml/2006/picture">
+                      <pic:pic xmlns:pic="http://schemas.openxmlformats.org/drawingml/2006/picture">
+                        <pic:nvPicPr>
+                          <pic:cNvPr id="439578902" name=""/>
+                          <pic:cNvPicPr/>
+                        </pic:nvPicPr>
+                        <pic:blipFill>
+                          <a:blip r:embed="rId8"/>
+                          <a:stretch>
+                            <a:fillRect/>
+                          </a:stretch>
+                        </pic:blipFill>
+                        <pic:spPr>
+                          <a:xfrm>
+                            <a:off x="0" y="0"/>
+                            <a:ext cx="1384309" cy="1656097"/>
+                          </a:xfrm>
+                          <a:prstGeom prst="rect">
+                            <a:avLst/>
+                          </a:prstGeom>
+                        </pic:spPr>
+                      </pic:pic>
+                    </a:graphicData>
+                  </a:graphic>
+                </wp:inline>
+              </w:drawing>
+            </w:r>
+          </w:p>
+          <w:p>
+            <w:pPr>
+              <w:spacing w:before="80" w:after="80"/>
+              <w:rPr>
+                <w:rFonts w:ascii="Arial" w:hAnsi="Arial" w:cs="Arial"/>
+                <w:color w:val="C00000"/>
+                <w:sz w:val="20"/>
+                <w:szCs w:val="20"/>
+              </w:rPr>
+            </w:pPr>
+            <w:r>
+              <w:rPr>
+                <w:rFonts w:ascii="Arial" w:hAnsi="Arial" w:cs="Arial"/>
+                <w:color w:val="C00000"/>
+                <w:sz w:val="20"/>
+                <w:szCs w:val="20"/>
+              </w:rPr>
+              <w:drawing>
+                <wp:inline distT="0" distB="0" distL="0" distR="0" wp14:anchorId="7CC633A0" wp14:editId="498FA44F">
+                  <wp:extent cx="1985211" cy="2181704"/>
+                  <wp:effectExtent l="0" t="0" r="0" b="9525"/>
+                  <wp:docPr id="745128745" name="Picture 1"/>
+                  <wp:cNvGraphicFramePr>
+                    <a:graphicFrameLocks xmlns:a="http://schemas.openxmlformats.org/drawingml/2006/main" noChangeAspect="1"/>
+                  </wp:cNvGraphicFramePr>
+                  <a:graphic xmlns:a="http://schemas.openxmlformats.org/drawingml/2006/main">
+                    <a:graphicData uri="http://schemas.openxmlformats.org/drawingml/2006/picture">
+                      <pic:pic xmlns:pic="http://schemas.openxmlformats.org/drawingml/2006/picture">
+                        <pic:nvPicPr>
+                          <pic:cNvPr id="745128745" name=""/>
+                          <pic:cNvPicPr/>
+                        </pic:nvPicPr>
+                        <pic:blipFill>
+                          <a:blip r:embed="rId9"/>
+                          <a:stretch>
+                            <a:fillRect/>
+                          </a:stretch>
+                        </pic:blipFill>
+                        <pic:spPr>
+                          <a:xfrm>
+                            <a:off x="0" y="0"/>
+                            <a:ext cx="1987521" cy="2184243"/>
+                          </a:xfrm>
+                          <a:prstGeom prst="rect">
+                            <a:avLst/>
+                          </a:prstGeom>
+                        </pic:spPr>
+                      </pic:pic>
+                    </a:graphicData>
+                  </a:graphic>
+                </wp:inline>
+              </w:drawing>
             </w:r>
           </w:p>
         </w:tc>
       </w:tr>
       <w:tr>
         <w:trPr>
-          <w:trHeight w:val="350"/>
+          <w:trHeight w:val="224"/>
         </w:trPr>
         <w:tc>
           <w:tcPr>
@@ -1647,62 +1672,72 @@
                 <w:sz w:val="20"/>
                 <w:szCs w:val="20"/>
               </w:rPr>
-              <w:t>The “Book Your Stay” button functioned correctly and redirected users to the reservation page without any issues. The Attractions page loaded properly and all text, images, and activity cards displayed clearly. Navigation between pages was smooth and the button placement made it easy for users to begin the reservation process.</w:t>
+              <w:t xml:space="preserve">The “Book Your Stay” button functioned correctly and redirected users to the reservation page without any issues. The Attractions page </w:t>
+            </w:r>
+            <w:proofErr w:type="gramStart"/>
+            <w:r>
+              <w:rPr>
+                <w:rFonts w:ascii="Arial" w:hAnsi="Arial" w:cs="Arial"/>
+                <w:color w:val="C00000"/>
+                <w:sz w:val="20"/>
+                <w:szCs w:val="20"/>
+              </w:rPr>
+              <w:t>loaded</w:t>
+            </w:r>
+            <w:proofErr w:type="gramEnd"/>
+            <w:r>
+              <w:rPr>
+                <w:rFonts w:ascii="Arial" w:hAnsi="Arial" w:cs="Arial"/>
+                <w:color w:val="C00000"/>
+                <w:sz w:val="20"/>
+                <w:szCs w:val="20"/>
+              </w:rPr>
+              <w:t xml:space="preserve"> </w:t>
+            </w:r>
+            <w:proofErr w:type="gramStart"/>
+            <w:r>
+              <w:rPr>
+                <w:rFonts w:ascii="Arial" w:hAnsi="Arial" w:cs="Arial"/>
+                <w:color w:val="C00000"/>
+                <w:sz w:val="20"/>
+                <w:szCs w:val="20"/>
+              </w:rPr>
+              <w:t>properly</w:t>
+            </w:r>
+            <w:proofErr w:type="gramEnd"/>
+            <w:r>
+              <w:rPr>
+                <w:rFonts w:ascii="Arial" w:hAnsi="Arial" w:cs="Arial"/>
+                <w:color w:val="C00000"/>
+                <w:sz w:val="20"/>
+                <w:szCs w:val="20"/>
+              </w:rPr>
+              <w:t xml:space="preserve"> and all text, images, and activity cards </w:t>
+            </w:r>
+            <w:proofErr w:type="gramStart"/>
+            <w:r>
+              <w:rPr>
+                <w:rFonts w:ascii="Arial" w:hAnsi="Arial" w:cs="Arial"/>
+                <w:color w:val="C00000"/>
+                <w:sz w:val="20"/>
+                <w:szCs w:val="20"/>
+              </w:rPr>
+              <w:t>displayed</w:t>
+            </w:r>
+            <w:proofErr w:type="gramEnd"/>
+            <w:r>
+              <w:rPr>
+                <w:rFonts w:ascii="Arial" w:hAnsi="Arial" w:cs="Arial"/>
+                <w:color w:val="C00000"/>
+                <w:sz w:val="20"/>
+                <w:szCs w:val="20"/>
+              </w:rPr>
+              <w:t xml:space="preserve"> clearly. Navigation between pages was smooth and the button placement made it easy for users to begin the reservation process.</w:t>
             </w:r>
           </w:p>
         </w:tc>
       </w:tr>
     </w:tbl>
-    <w:p>
-      <w:pPr>
-        <w:pStyle w:val="NoSpacing"/>
-        <w:rPr>
-          <w:rFonts w:ascii="Arial" w:hAnsi="Arial" w:cs="Arial"/>
-          <w:sz w:val="24"/>
-          <w:szCs w:val="24"/>
-        </w:rPr>
-      </w:pPr>
-    </w:p>
-    <w:p>
-      <w:pPr>
-        <w:pStyle w:val="NoSpacing"/>
-        <w:rPr>
-          <w:rFonts w:ascii="Arial" w:hAnsi="Arial" w:cs="Arial"/>
-          <w:sz w:val="24"/>
-          <w:szCs w:val="24"/>
-        </w:rPr>
-      </w:pPr>
-    </w:p>
-    <w:p>
-      <w:pPr>
-        <w:pStyle w:val="NoSpacing"/>
-        <w:rPr>
-          <w:rFonts w:ascii="Arial" w:hAnsi="Arial" w:cs="Arial"/>
-          <w:sz w:val="24"/>
-          <w:szCs w:val="24"/>
-        </w:rPr>
-      </w:pPr>
-    </w:p>
-    <w:p>
-      <w:pPr>
-        <w:pStyle w:val="NoSpacing"/>
-        <w:rPr>
-          <w:rFonts w:ascii="Arial" w:hAnsi="Arial" w:cs="Arial"/>
-          <w:sz w:val="24"/>
-          <w:szCs w:val="24"/>
-        </w:rPr>
-      </w:pPr>
-    </w:p>
-    <w:p>
-      <w:pPr>
-        <w:pStyle w:val="NoSpacing"/>
-        <w:rPr>
-          <w:rFonts w:ascii="Arial" w:hAnsi="Arial" w:cs="Arial"/>
-          <w:sz w:val="24"/>
-          <w:szCs w:val="24"/>
-        </w:rPr>
-      </w:pPr>
-    </w:p>
     <w:p>
       <w:pPr>
         <w:pStyle w:val="NoSpacing"/>
@@ -1821,10 +1856,10 @@
       </w:tblPr>
       <w:tblGrid>
         <w:gridCol w:w="1250"/>
-        <w:gridCol w:w="3570"/>
-        <w:gridCol w:w="3930"/>
-        <w:gridCol w:w="2148"/>
-        <w:gridCol w:w="2052"/>
+        <w:gridCol w:w="1493"/>
+        <w:gridCol w:w="2093"/>
+        <w:gridCol w:w="1268"/>
+        <w:gridCol w:w="6846"/>
       </w:tblGrid>
       <w:tr>
         <w:trPr>
@@ -2084,6 +2119,16 @@
               </w:rPr>
               <w:t xml:space="preserve">Peer tester: </w:t>
             </w:r>
+            <w:r>
+              <w:rPr>
+                <w:rFonts w:ascii="Arial" w:hAnsi="Arial" w:cs="Arial"/>
+                <w:b/>
+                <w:bCs/>
+                <w:sz w:val="20"/>
+                <w:szCs w:val="20"/>
+              </w:rPr>
+              <w:t>Zachary Anderson</w:t>
+            </w:r>
           </w:p>
           <w:p>
             <w:pPr>
@@ -2118,27 +2163,7 @@
                 <w:sz w:val="20"/>
                 <w:szCs w:val="20"/>
               </w:rPr>
-              <w:t>&lt;</w:t>
-            </w:r>
-            <w:proofErr w:type="spellStart"/>
-            <w:r>
-              <w:rPr>
-                <w:rFonts w:ascii="Arial" w:hAnsi="Arial" w:cs="Arial"/>
-                <w:color w:val="C00000"/>
-                <w:sz w:val="20"/>
-                <w:szCs w:val="20"/>
-              </w:rPr>
-              <w:t>yyyy</w:t>
-            </w:r>
-            <w:proofErr w:type="spellEnd"/>
-            <w:r>
-              <w:rPr>
-                <w:rFonts w:ascii="Arial" w:hAnsi="Arial" w:cs="Arial"/>
-                <w:color w:val="C00000"/>
-                <w:sz w:val="20"/>
-                <w:szCs w:val="20"/>
-              </w:rPr>
-              <w:t>/mm/dd&gt;</w:t>
+              <w:t>5/6/26</w:t>
             </w:r>
           </w:p>
         </w:tc>
@@ -2384,7 +2409,7 @@
                 <w:sz w:val="20"/>
                 <w:szCs w:val="20"/>
               </w:rPr>
-              <w:t>&lt;yes/no&gt;</w:t>
+              <w:t>Pass</w:t>
             </w:r>
           </w:p>
         </w:tc>
@@ -2409,7 +2434,61 @@
                 <w:sz w:val="20"/>
                 <w:szCs w:val="20"/>
               </w:rPr>
-              <w:t>&lt;yes/no&gt;</w:t>
+              <w:t>Pass</w:t>
+            </w:r>
+          </w:p>
+          <w:p>
+            <w:pPr>
+              <w:spacing w:before="80" w:after="80"/>
+              <w:rPr>
+                <w:rFonts w:ascii="Arial" w:hAnsi="Arial" w:cs="Arial"/>
+                <w:color w:val="C00000"/>
+                <w:sz w:val="20"/>
+                <w:szCs w:val="20"/>
+              </w:rPr>
+            </w:pPr>
+            <w:r>
+              <w:rPr>
+                <w:rFonts w:ascii="Arial" w:hAnsi="Arial" w:cs="Arial"/>
+                <w:color w:val="C00000"/>
+                <w:sz w:val="20"/>
+                <w:szCs w:val="20"/>
+              </w:rPr>
+              <w:drawing>
+                <wp:inline distT="0" distB="0" distL="0" distR="0" wp14:anchorId="2CF3783D" wp14:editId="4AD59129">
+                  <wp:extent cx="1850833" cy="1746527"/>
+                  <wp:effectExtent l="0" t="0" r="0" b="6350"/>
+                  <wp:docPr id="708048634" name="Picture 1"/>
+                  <wp:cNvGraphicFramePr>
+                    <a:graphicFrameLocks xmlns:a="http://schemas.openxmlformats.org/drawingml/2006/main" noChangeAspect="1"/>
+                  </wp:cNvGraphicFramePr>
+                  <a:graphic xmlns:a="http://schemas.openxmlformats.org/drawingml/2006/main">
+                    <a:graphicData uri="http://schemas.openxmlformats.org/drawingml/2006/picture">
+                      <pic:pic xmlns:pic="http://schemas.openxmlformats.org/drawingml/2006/picture">
+                        <pic:nvPicPr>
+                          <pic:cNvPr id="1840342366" name=""/>
+                          <pic:cNvPicPr/>
+                        </pic:nvPicPr>
+                        <pic:blipFill>
+                          <a:blip r:embed="rId7"/>
+                          <a:stretch>
+                            <a:fillRect/>
+                          </a:stretch>
+                        </pic:blipFill>
+                        <pic:spPr>
+                          <a:xfrm>
+                            <a:off x="0" y="0"/>
+                            <a:ext cx="1867060" cy="1761839"/>
+                          </a:xfrm>
+                          <a:prstGeom prst="rect">
+                            <a:avLst/>
+                          </a:prstGeom>
+                        </pic:spPr>
+                      </pic:pic>
+                    </a:graphicData>
+                  </a:graphic>
+                </wp:inline>
+              </w:drawing>
             </w:r>
           </w:p>
         </w:tc>
@@ -2437,6 +2516,7 @@
                 <w:sz w:val="20"/>
                 <w:szCs w:val="20"/>
               </w:rPr>
+              <w:lastRenderedPageBreak/>
               <w:t>2</w:t>
             </w:r>
           </w:p>
@@ -2512,7 +2592,7 @@
                 <w:sz w:val="20"/>
                 <w:szCs w:val="20"/>
               </w:rPr>
-              <w:t>&lt;yes/no&gt;</w:t>
+              <w:t>Pass</w:t>
             </w:r>
           </w:p>
         </w:tc>
@@ -2537,7 +2617,61 @@
                 <w:sz w:val="20"/>
                 <w:szCs w:val="20"/>
               </w:rPr>
-              <w:t>&lt;yes/no&gt;</w:t>
+              <w:t>Pass</w:t>
+            </w:r>
+          </w:p>
+          <w:p>
+            <w:pPr>
+              <w:spacing w:before="80" w:after="80"/>
+              <w:rPr>
+                <w:rFonts w:ascii="Arial" w:hAnsi="Arial" w:cs="Arial"/>
+                <w:color w:val="C00000"/>
+                <w:sz w:val="20"/>
+                <w:szCs w:val="20"/>
+              </w:rPr>
+            </w:pPr>
+            <w:r>
+              <w:rPr>
+                <w:rFonts w:ascii="Arial" w:hAnsi="Arial" w:cs="Arial"/>
+                <w:color w:val="C00000"/>
+                <w:sz w:val="20"/>
+                <w:szCs w:val="20"/>
+              </w:rPr>
+              <w:drawing>
+                <wp:inline distT="0" distB="0" distL="0" distR="0" wp14:anchorId="0C726695" wp14:editId="4684F49B">
+                  <wp:extent cx="3700830" cy="3227942"/>
+                  <wp:effectExtent l="0" t="0" r="0" b="0"/>
+                  <wp:docPr id="412920646" name="Picture 1"/>
+                  <wp:cNvGraphicFramePr>
+                    <a:graphicFrameLocks xmlns:a="http://schemas.openxmlformats.org/drawingml/2006/main" noChangeAspect="1"/>
+                  </wp:cNvGraphicFramePr>
+                  <a:graphic xmlns:a="http://schemas.openxmlformats.org/drawingml/2006/main">
+                    <a:graphicData uri="http://schemas.openxmlformats.org/drawingml/2006/picture">
+                      <pic:pic xmlns:pic="http://schemas.openxmlformats.org/drawingml/2006/picture">
+                        <pic:nvPicPr>
+                          <pic:cNvPr id="412920646" name=""/>
+                          <pic:cNvPicPr/>
+                        </pic:nvPicPr>
+                        <pic:blipFill>
+                          <a:blip r:embed="rId10"/>
+                          <a:stretch>
+                            <a:fillRect/>
+                          </a:stretch>
+                        </pic:blipFill>
+                        <pic:spPr>
+                          <a:xfrm>
+                            <a:off x="0" y="0"/>
+                            <a:ext cx="3725892" cy="3249802"/>
+                          </a:xfrm>
+                          <a:prstGeom prst="rect">
+                            <a:avLst/>
+                          </a:prstGeom>
+                        </pic:spPr>
+                      </pic:pic>
+                    </a:graphicData>
+                  </a:graphic>
+                </wp:inline>
+              </w:drawing>
             </w:r>
           </w:p>
         </w:tc>
@@ -2676,7 +2810,7 @@
                 <w:sz w:val="20"/>
                 <w:szCs w:val="20"/>
               </w:rPr>
-              <w:t>&lt;yes/no&gt;</w:t>
+              <w:t>Pass</w:t>
             </w:r>
           </w:p>
         </w:tc>
@@ -2701,7 +2835,116 @@
                 <w:sz w:val="20"/>
                 <w:szCs w:val="20"/>
               </w:rPr>
-              <w:t>&lt;yes/no&gt;</w:t>
+              <w:t>Pass</w:t>
+            </w:r>
+          </w:p>
+          <w:p>
+            <w:pPr>
+              <w:spacing w:before="80" w:after="80"/>
+              <w:rPr>
+                <w:rFonts w:ascii="Arial" w:hAnsi="Arial" w:cs="Arial"/>
+                <w:color w:val="C00000"/>
+                <w:sz w:val="20"/>
+                <w:szCs w:val="20"/>
+              </w:rPr>
+            </w:pPr>
+            <w:r>
+              <w:rPr>
+                <w:rFonts w:ascii="Arial" w:hAnsi="Arial" w:cs="Arial"/>
+                <w:color w:val="C00000"/>
+                <w:sz w:val="20"/>
+                <w:szCs w:val="20"/>
+              </w:rPr>
+              <w:drawing>
+                <wp:inline distT="0" distB="0" distL="0" distR="0" wp14:anchorId="7F3E7F11" wp14:editId="339DEC93">
+                  <wp:extent cx="4204867" cy="2026736"/>
+                  <wp:effectExtent l="0" t="0" r="5715" b="0"/>
+                  <wp:docPr id="188399126" name="Picture 1"/>
+                  <wp:cNvGraphicFramePr>
+                    <a:graphicFrameLocks xmlns:a="http://schemas.openxmlformats.org/drawingml/2006/main" noChangeAspect="1"/>
+                  </wp:cNvGraphicFramePr>
+                  <a:graphic xmlns:a="http://schemas.openxmlformats.org/drawingml/2006/main">
+                    <a:graphicData uri="http://schemas.openxmlformats.org/drawingml/2006/picture">
+                      <pic:pic xmlns:pic="http://schemas.openxmlformats.org/drawingml/2006/picture">
+                        <pic:nvPicPr>
+                          <pic:cNvPr id="188399126" name=""/>
+                          <pic:cNvPicPr/>
+                        </pic:nvPicPr>
+                        <pic:blipFill>
+                          <a:blip r:embed="rId11"/>
+                          <a:stretch>
+                            <a:fillRect/>
+                          </a:stretch>
+                        </pic:blipFill>
+                        <pic:spPr>
+                          <a:xfrm>
+                            <a:off x="0" y="0"/>
+                            <a:ext cx="4221547" cy="2034776"/>
+                          </a:xfrm>
+                          <a:prstGeom prst="rect">
+                            <a:avLst/>
+                          </a:prstGeom>
+                        </pic:spPr>
+                      </pic:pic>
+                    </a:graphicData>
+                  </a:graphic>
+                </wp:inline>
+              </w:drawing>
+            </w:r>
+          </w:p>
+          <w:p>
+            <w:pPr>
+              <w:spacing w:before="80" w:after="80"/>
+              <w:rPr>
+                <w:rFonts w:ascii="Arial" w:hAnsi="Arial" w:cs="Arial"/>
+                <w:color w:val="C00000"/>
+                <w:sz w:val="20"/>
+                <w:szCs w:val="20"/>
+              </w:rPr>
+            </w:pPr>
+            <w:r>
+              <w:rPr>
+                <w:rFonts w:ascii="Arial" w:hAnsi="Arial" w:cs="Arial"/>
+                <w:color w:val="C00000"/>
+                <w:sz w:val="20"/>
+                <w:szCs w:val="20"/>
+              </w:rPr>
+              <w:lastRenderedPageBreak/>
+              <w:drawing>
+                <wp:inline distT="0" distB="0" distL="0" distR="0" wp14:anchorId="2915D5B1" wp14:editId="4DEFDF2E">
+                  <wp:extent cx="3712684" cy="4987900"/>
+                  <wp:effectExtent l="0" t="0" r="2540" b="3810"/>
+                  <wp:docPr id="2074542853" name="Picture 1"/>
+                  <wp:cNvGraphicFramePr>
+                    <a:graphicFrameLocks xmlns:a="http://schemas.openxmlformats.org/drawingml/2006/main" noChangeAspect="1"/>
+                  </wp:cNvGraphicFramePr>
+                  <a:graphic xmlns:a="http://schemas.openxmlformats.org/drawingml/2006/main">
+                    <a:graphicData uri="http://schemas.openxmlformats.org/drawingml/2006/picture">
+                      <pic:pic xmlns:pic="http://schemas.openxmlformats.org/drawingml/2006/picture">
+                        <pic:nvPicPr>
+                          <pic:cNvPr id="2074542853" name=""/>
+                          <pic:cNvPicPr/>
+                        </pic:nvPicPr>
+                        <pic:blipFill>
+                          <a:blip r:embed="rId12"/>
+                          <a:stretch>
+                            <a:fillRect/>
+                          </a:stretch>
+                        </pic:blipFill>
+                        <pic:spPr>
+                          <a:xfrm>
+                            <a:off x="0" y="0"/>
+                            <a:ext cx="3723583" cy="5002543"/>
+                          </a:xfrm>
+                          <a:prstGeom prst="rect">
+                            <a:avLst/>
+                          </a:prstGeom>
+                        </pic:spPr>
+                      </pic:pic>
+                    </a:graphicData>
+                  </a:graphic>
+                </wp:inline>
+              </w:drawing>
             </w:r>
           </w:p>
         </w:tc>
@@ -2733,6 +2976,7 @@
                 <w:sz w:val="20"/>
                 <w:szCs w:val="20"/>
               </w:rPr>
+              <w:lastRenderedPageBreak/>
               <w:t>Comments</w:t>
             </w:r>
           </w:p>
@@ -2795,29 +3039,9 @@
         </w:rPr>
       </w:pPr>
     </w:p>
-    <w:p>
-      <w:pPr>
-        <w:pStyle w:val="NoSpacing"/>
-        <w:rPr>
-          <w:rFonts w:ascii="Arial" w:hAnsi="Arial" w:cs="Arial"/>
-          <w:sz w:val="24"/>
-          <w:szCs w:val="24"/>
-        </w:rPr>
-      </w:pPr>
-    </w:p>
-    <w:p>
-      <w:pPr>
-        <w:pStyle w:val="NoSpacing"/>
-        <w:rPr>
-          <w:rFonts w:ascii="Arial" w:hAnsi="Arial" w:cs="Arial"/>
-          <w:sz w:val="24"/>
-          <w:szCs w:val="24"/>
-        </w:rPr>
-      </w:pPr>
-    </w:p>
     <w:sectPr>
-      <w:headerReference w:type="default" r:id="rId7"/>
-      <w:footerReference w:type="default" r:id="rId8"/>
+      <w:headerReference w:type="default" r:id="rId13"/>
+      <w:footerReference w:type="default" r:id="rId14"/>
       <w:pgSz w:w="15840" w:h="12240" w:orient="landscape"/>
       <w:pgMar w:top="1440" w:right="1440" w:bottom="1440" w:left="1440" w:header="720" w:footer="720" w:gutter="0"/>
       <w:cols w:space="720"/>
@@ -3466,6 +3690,7 @@
   <w:style w:type="character" w:default="1" w:styleId="DefaultParagraphFont">
     <w:name w:val="Default Paragraph Font"/>
     <w:uiPriority w:val="1"/>
+    <w:semiHidden/>
     <w:unhideWhenUsed/>
   </w:style>
   <w:style w:type="table" w:default="1" w:styleId="TableNormal">

</xml_diff>